<commit_message>
New field + reorder
</commit_message>
<xml_diff>
--- a/Troubleshooting and Testing.docx
+++ b/Troubleshooting and Testing.docx
@@ -128,13 +128,8 @@
     </w:p>
     <w:p/>
     <w:p>
-      <w:proofErr w:type="spellStart"/>
-      <w:r>
-        <w:t>i</w:t>
-      </w:r>
-      <w:proofErr w:type="spellEnd"/>
-      <w:r>
-        <w:t xml:space="preserve"> want to renovate </w:t>
+      <w:r>
+        <w:t xml:space="preserve">i want to renovate </w:t>
       </w:r>
       <w:r>
         <w:t xml:space="preserve">the </w:t>
@@ -168,15 +163,7 @@
     </w:p>
     <w:p>
       <w:r>
-        <w:t xml:space="preserve">Check below points and </w:t>
-      </w:r>
-      <w:proofErr w:type="gramStart"/>
-      <w:r>
-        <w:t>lets</w:t>
-      </w:r>
-      <w:proofErr w:type="gramEnd"/>
-      <w:r>
-        <w:t xml:space="preserve"> discuss the enhancement that it will make on the system if implemented:</w:t>
+        <w:t>Check below points and lets discuss the enhancement that it will make on the system if implemented:</w:t>
       </w:r>
     </w:p>
     <w:p/>
@@ -284,17 +271,7 @@
         </w:numPr>
       </w:pPr>
       <w:r>
-        <w:t xml:space="preserve">Ok I agree on this point we use only chrome so </w:t>
-      </w:r>
-      <w:proofErr w:type="spellStart"/>
-      <w:proofErr w:type="gramStart"/>
-      <w:r>
-        <w:t>lets</w:t>
-      </w:r>
-      <w:proofErr w:type="spellEnd"/>
-      <w:proofErr w:type="gramEnd"/>
-      <w:r>
-        <w:t xml:space="preserve"> do the sync (</w:t>
+        <w:t>Ok I agree on this point we use only chrome so lets do the sync (</w:t>
       </w:r>
       <w:r>
         <w:rPr>
@@ -379,15 +356,7 @@
         <w:t>below</w:t>
       </w:r>
       <w:r>
-        <w:t xml:space="preserve">, also for the dates in the below list need to be with its order that is if there is a date in the list is after another date then when the user enter this date it </w:t>
-      </w:r>
-      <w:proofErr w:type="spellStart"/>
-      <w:r>
-        <w:t>cant</w:t>
-      </w:r>
-      <w:proofErr w:type="spellEnd"/>
-      <w:r>
-        <w:t xml:space="preserve"> be an earlier date</w:t>
+        <w:t>, also for the dates in the below list need to be with its order that is if there is a date in the list is after another date then when the user enter this date it cant be an earlier date</w:t>
       </w:r>
       <w:r>
         <w:t xml:space="preserve"> but could be same date</w:t>
@@ -880,23 +849,7 @@
           <w:b/>
           <w:bCs/>
         </w:rPr>
-        <w:t xml:space="preserve">Request Date for </w:t>
-      </w:r>
-      <w:proofErr w:type="spellStart"/>
-      <w:r>
-        <w:rPr>
-          <w:b/>
-          <w:bCs/>
-        </w:rPr>
-        <w:t>Agr</w:t>
-      </w:r>
-      <w:proofErr w:type="spellEnd"/>
-      <w:r>
-        <w:rPr>
-          <w:b/>
-          <w:bCs/>
-        </w:rPr>
-        <w:t>. NTRA Cover</w:t>
+        <w:t>Request Date for Agr. NTRA Cover</w:t>
       </w:r>
     </w:p>
     <w:p>
@@ -927,22 +880,13 @@
           <w:bCs/>
         </w:rPr>
       </w:pPr>
-      <w:proofErr w:type="spellStart"/>
       <w:r>
         <w:rPr>
           <w:b/>
           <w:bCs/>
         </w:rPr>
         <w:lastRenderedPageBreak/>
-        <w:t>Agr</w:t>
-      </w:r>
-      <w:proofErr w:type="spellEnd"/>
-      <w:r>
-        <w:rPr>
-          <w:b/>
-          <w:bCs/>
-        </w:rPr>
-        <w:t>. Cover</w:t>
+        <w:t>Agr. Cover</w:t>
       </w:r>
       <w:r>
         <w:rPr>
@@ -974,14 +918,7 @@
           <w:b/>
           <w:bCs/>
         </w:rPr>
-        <w:t xml:space="preserve"> </w:t>
-      </w:r>
-      <w:r>
-        <w:rPr>
-          <w:b/>
-          <w:bCs/>
-        </w:rPr>
-        <w:t>Date</w:t>
+        <w:t xml:space="preserve"> Date</w:t>
       </w:r>
     </w:p>
     <w:p>
@@ -1006,14 +943,7 @@
           <w:b/>
           <w:bCs/>
         </w:rPr>
-        <w:t xml:space="preserve"> </w:t>
-      </w:r>
-      <w:r>
-        <w:rPr>
-          <w:b/>
-          <w:bCs/>
-        </w:rPr>
-        <w:t>Date</w:t>
+        <w:t xml:space="preserve"> Date</w:t>
       </w:r>
     </w:p>
     <w:p>
@@ -1321,14 +1251,7 @@
           <w:b/>
           <w:bCs/>
         </w:rPr>
-        <w:t>A</w:t>
-      </w:r>
-      <w:r>
-        <w:rPr>
-          <w:b/>
-          <w:bCs/>
-        </w:rPr>
-        <w:t xml:space="preserve">llowance </w:t>
+        <w:t xml:space="preserve">Allowance </w:t>
       </w:r>
       <w:r>
         <w:rPr>
@@ -1752,6 +1675,489 @@
         </w:rPr>
       </w:pPr>
     </w:p>
+    <w:p>
+      <w:r>
+        <w:t>I want to make some changes</w:t>
+      </w:r>
+      <w:r>
+        <w:t xml:space="preserve"> </w:t>
+      </w:r>
+      <w:r>
+        <w:t>as following:</w:t>
+      </w:r>
+    </w:p>
+    <w:p>
+      <w:r>
+        <w:t xml:space="preserve">Create a new field </w:t>
+      </w:r>
+      <w:r>
+        <w:t xml:space="preserve">SF3 </w:t>
+      </w:r>
+      <w:r>
+        <w:t xml:space="preserve">Status this will be </w:t>
+      </w:r>
+      <w:r>
+        <w:t xml:space="preserve">a </w:t>
+      </w:r>
+      <w:r>
+        <w:t xml:space="preserve">list and it will be before </w:t>
+      </w:r>
+      <w:r>
+        <w:t>SF3 Comment</w:t>
+      </w:r>
+      <w:r>
+        <w:t xml:space="preserve"> field and for the </w:t>
+      </w:r>
+      <w:r>
+        <w:t>SF3 Comment</w:t>
+      </w:r>
+      <w:r>
+        <w:t xml:space="preserve"> it will be text</w:t>
+      </w:r>
+      <w:r>
+        <w:t xml:space="preserve"> need to replace the </w:t>
+      </w:r>
+      <w:r>
+        <w:rPr>
+          <w:b/>
+          <w:bCs/>
+        </w:rPr>
+        <w:t>SF3 Comment</w:t>
+      </w:r>
+      <w:r>
+        <w:t xml:space="preserve"> in the setting with the </w:t>
+      </w:r>
+      <w:r>
+        <w:rPr>
+          <w:b/>
+          <w:bCs/>
+        </w:rPr>
+        <w:t xml:space="preserve">SF3 </w:t>
+      </w:r>
+      <w:r>
+        <w:rPr>
+          <w:b/>
+          <w:bCs/>
+        </w:rPr>
+        <w:t>Status</w:t>
+      </w:r>
+    </w:p>
+    <w:p>
+      <w:r>
+        <w:t xml:space="preserve">If the status is reject I need to dim all the fields after the </w:t>
+      </w:r>
+      <w:r>
+        <w:rPr>
+          <w:b/>
+          <w:bCs/>
+        </w:rPr>
+        <w:t>SF3 Comment</w:t>
+      </w:r>
+      <w:r>
+        <w:rPr>
+          <w:b/>
+          <w:bCs/>
+        </w:rPr>
+        <w:t xml:space="preserve"> </w:t>
+      </w:r>
+      <w:r>
+        <w:t xml:space="preserve">field as they will be irrelevant </w:t>
+      </w:r>
+    </w:p>
+    <w:p/>
+    <w:p>
+      <w:pPr>
+        <w:rPr>
+          <w:b/>
+          <w:bCs/>
+        </w:rPr>
+      </w:pPr>
+      <w:r>
+        <w:t xml:space="preserve">I need to change these </w:t>
+      </w:r>
+      <w:r>
+        <w:t>fields</w:t>
+      </w:r>
+      <w:r>
+        <w:br/>
+      </w:r>
+    </w:p>
+    <w:p>
+      <w:pPr>
+        <w:pStyle w:val="ListParagraph"/>
+        <w:numPr>
+          <w:ilvl w:val="0"/>
+          <w:numId w:val="5"/>
+        </w:numPr>
+        <w:rPr>
+          <w:b/>
+          <w:bCs/>
+        </w:rPr>
+      </w:pPr>
+      <w:r>
+        <w:rPr>
+          <w:b/>
+          <w:bCs/>
+        </w:rPr>
+        <w:t>SF3 Comment long text box</w:t>
+      </w:r>
+    </w:p>
+    <w:p>
+      <w:pPr>
+        <w:pStyle w:val="ListParagraph"/>
+        <w:numPr>
+          <w:ilvl w:val="0"/>
+          <w:numId w:val="5"/>
+        </w:numPr>
+        <w:rPr>
+          <w:b/>
+          <w:bCs/>
+        </w:rPr>
+      </w:pPr>
+      <w:r>
+        <w:rPr>
+          <w:b/>
+          <w:bCs/>
+        </w:rPr>
+        <w:t>Rental Value</w:t>
+      </w:r>
+      <w:r>
+        <w:rPr>
+          <w:b/>
+          <w:bCs/>
+        </w:rPr>
+        <w:t xml:space="preserve"> currency EGP</w:t>
+      </w:r>
+    </w:p>
+    <w:p>
+      <w:pPr>
+        <w:pStyle w:val="ListParagraph"/>
+        <w:numPr>
+          <w:ilvl w:val="0"/>
+          <w:numId w:val="5"/>
+        </w:numPr>
+        <w:rPr>
+          <w:b/>
+          <w:bCs/>
+        </w:rPr>
+      </w:pPr>
+      <w:r>
+        <w:rPr>
+          <w:b/>
+          <w:bCs/>
+        </w:rPr>
+        <w:t>Owner Phone</w:t>
+      </w:r>
+      <w:r>
+        <w:rPr>
+          <w:b/>
+          <w:bCs/>
+        </w:rPr>
+        <w:t xml:space="preserve"> numbers only</w:t>
+      </w:r>
+    </w:p>
+    <w:p>
+      <w:pPr>
+        <w:pStyle w:val="ListParagraph"/>
+        <w:numPr>
+          <w:ilvl w:val="0"/>
+          <w:numId w:val="5"/>
+        </w:numPr>
+        <w:rPr>
+          <w:b/>
+          <w:bCs/>
+        </w:rPr>
+      </w:pPr>
+      <w:r>
+        <w:rPr>
+          <w:b/>
+          <w:bCs/>
+        </w:rPr>
+        <w:t>Cooperation</w:t>
+      </w:r>
+      <w:r>
+        <w:rPr>
+          <w:b/>
+          <w:bCs/>
+        </w:rPr>
+        <w:t xml:space="preserve"> long text box</w:t>
+      </w:r>
+    </w:p>
+    <w:p>
+      <w:pPr>
+        <w:pStyle w:val="ListParagraph"/>
+        <w:numPr>
+          <w:ilvl w:val="0"/>
+          <w:numId w:val="5"/>
+        </w:numPr>
+        <w:rPr>
+          <w:b/>
+          <w:bCs/>
+        </w:rPr>
+      </w:pPr>
+      <w:r>
+        <w:rPr>
+          <w:b/>
+          <w:bCs/>
+        </w:rPr>
+        <w:t>PMQ Amount</w:t>
+      </w:r>
+      <w:r>
+        <w:rPr>
+          <w:b/>
+          <w:bCs/>
+        </w:rPr>
+        <w:t xml:space="preserve"> </w:t>
+      </w:r>
+      <w:r>
+        <w:rPr>
+          <w:b/>
+          <w:bCs/>
+        </w:rPr>
+        <w:t>currency EGP</w:t>
+      </w:r>
+    </w:p>
+    <w:p>
+      <w:pPr>
+        <w:pStyle w:val="ListParagraph"/>
+        <w:numPr>
+          <w:ilvl w:val="0"/>
+          <w:numId w:val="5"/>
+        </w:numPr>
+        <w:rPr>
+          <w:b/>
+          <w:bCs/>
+        </w:rPr>
+      </w:pPr>
+      <w:r>
+        <w:rPr>
+          <w:b/>
+          <w:bCs/>
+        </w:rPr>
+        <w:t>Acquisition Manager</w:t>
+      </w:r>
+      <w:r>
+        <w:rPr>
+          <w:b/>
+          <w:bCs/>
+        </w:rPr>
+        <w:t xml:space="preserve"> list</w:t>
+      </w:r>
+    </w:p>
+    <w:p>
+      <w:pPr>
+        <w:pStyle w:val="ListParagraph"/>
+        <w:numPr>
+          <w:ilvl w:val="0"/>
+          <w:numId w:val="5"/>
+        </w:numPr>
+        <w:rPr>
+          <w:b/>
+          <w:bCs/>
+        </w:rPr>
+      </w:pPr>
+      <w:r>
+        <w:rPr>
+          <w:b/>
+          <w:bCs/>
+        </w:rPr>
+        <w:t>Negotiator</w:t>
+      </w:r>
+      <w:r>
+        <w:rPr>
+          <w:b/>
+          <w:bCs/>
+        </w:rPr>
+        <w:t xml:space="preserve"> list</w:t>
+      </w:r>
+    </w:p>
+    <w:p>
+      <w:pPr>
+        <w:pStyle w:val="ListParagraph"/>
+        <w:numPr>
+          <w:ilvl w:val="0"/>
+          <w:numId w:val="5"/>
+        </w:numPr>
+        <w:rPr>
+          <w:b/>
+          <w:bCs/>
+        </w:rPr>
+      </w:pPr>
+      <w:r>
+        <w:rPr>
+          <w:b/>
+          <w:bCs/>
+        </w:rPr>
+        <w:t>Surveyor</w:t>
+      </w:r>
+      <w:r>
+        <w:rPr>
+          <w:b/>
+          <w:bCs/>
+        </w:rPr>
+        <w:t xml:space="preserve"> list</w:t>
+      </w:r>
+    </w:p>
+    <w:p>
+      <w:pPr>
+        <w:pStyle w:val="ListParagraph"/>
+        <w:numPr>
+          <w:ilvl w:val="0"/>
+          <w:numId w:val="5"/>
+        </w:numPr>
+        <w:rPr>
+          <w:b/>
+          <w:bCs/>
+        </w:rPr>
+      </w:pPr>
+      <w:r>
+        <w:rPr>
+          <w:b/>
+          <w:bCs/>
+        </w:rPr>
+        <w:t>Permitted By</w:t>
+      </w:r>
+      <w:r>
+        <w:rPr>
+          <w:b/>
+          <w:bCs/>
+        </w:rPr>
+        <w:t xml:space="preserve"> list</w:t>
+      </w:r>
+    </w:p>
+    <w:p>
+      <w:pPr>
+        <w:pStyle w:val="ListParagraph"/>
+        <w:numPr>
+          <w:ilvl w:val="0"/>
+          <w:numId w:val="5"/>
+        </w:numPr>
+        <w:rPr>
+          <w:b/>
+          <w:bCs/>
+        </w:rPr>
+      </w:pPr>
+      <w:r>
+        <w:rPr>
+          <w:b/>
+          <w:bCs/>
+        </w:rPr>
+        <w:t>PM Charge Receipt</w:t>
+      </w:r>
+      <w:r>
+        <w:rPr>
+          <w:b/>
+          <w:bCs/>
+        </w:rPr>
+        <w:t xml:space="preserve"> change it to </w:t>
+      </w:r>
+      <w:r>
+        <w:rPr>
+          <w:b/>
+          <w:bCs/>
+        </w:rPr>
+        <w:t xml:space="preserve">PM Charge </w:t>
+      </w:r>
+      <w:r>
+        <w:rPr>
+          <w:b/>
+          <w:bCs/>
+        </w:rPr>
+        <w:t>Date</w:t>
+      </w:r>
+    </w:p>
+    <w:p>
+      <w:pPr>
+        <w:rPr>
+          <w:b/>
+          <w:bCs/>
+        </w:rPr>
+      </w:pPr>
+      <w:r>
+        <w:rPr>
+          <w:b/>
+          <w:bCs/>
+        </w:rPr>
+        <w:t>Reorder the following</w:t>
+      </w:r>
+    </w:p>
+    <w:p>
+      <w:pPr>
+        <w:pStyle w:val="ListParagraph"/>
+        <w:numPr>
+          <w:ilvl w:val="0"/>
+          <w:numId w:val="4"/>
+        </w:numPr>
+        <w:rPr>
+          <w:b/>
+          <w:bCs/>
+        </w:rPr>
+      </w:pPr>
+      <w:r>
+        <w:rPr>
+          <w:b/>
+          <w:bCs/>
+        </w:rPr>
+        <w:t>Power Source</w:t>
+      </w:r>
+      <w:r>
+        <w:rPr>
+          <w:b/>
+          <w:bCs/>
+        </w:rPr>
+        <w:t xml:space="preserve"> then </w:t>
+      </w:r>
+      <w:r>
+        <w:rPr>
+          <w:b/>
+          <w:bCs/>
+        </w:rPr>
+        <w:t>PMQ Date</w:t>
+      </w:r>
+      <w:r>
+        <w:rPr>
+          <w:b/>
+          <w:bCs/>
+        </w:rPr>
+        <w:t xml:space="preserve"> then </w:t>
+      </w:r>
+      <w:r>
+        <w:rPr>
+          <w:b/>
+          <w:bCs/>
+        </w:rPr>
+        <w:t>PMQ Amount</w:t>
+      </w:r>
+      <w:r>
+        <w:rPr>
+          <w:b/>
+          <w:bCs/>
+        </w:rPr>
+        <w:t xml:space="preserve"> then</w:t>
+      </w:r>
+      <w:r>
+        <w:rPr>
+          <w:b/>
+          <w:bCs/>
+        </w:rPr>
+        <w:t xml:space="preserve"> add Initial PM Installation Date then</w:t>
+      </w:r>
+      <w:r>
+        <w:rPr>
+          <w:b/>
+          <w:bCs/>
+        </w:rPr>
+        <w:t xml:space="preserve"> </w:t>
+      </w:r>
+      <w:r>
+        <w:rPr>
+          <w:b/>
+          <w:bCs/>
+        </w:rPr>
+        <w:t>PM Charge Date</w:t>
+      </w:r>
+    </w:p>
+    <w:p/>
     <w:p>
       <w:pPr>
         <w:rPr>
@@ -1886,6 +2292,119 @@
     </w:lvl>
   </w:abstractNum>
   <w:abstractNum w:abstractNumId="1" w15:restartNumberingAfterBreak="0">
+    <w:nsid w:val="2A217F83"/>
+    <w:multiLevelType w:val="hybridMultilevel"/>
+    <w:tmpl w:val="1F1A77F8"/>
+    <w:lvl w:ilvl="0" w:tplc="04090001">
+      <w:start w:val="1"/>
+      <w:numFmt w:val="bullet"/>
+      <w:lvlText w:val=""/>
+      <w:lvlJc w:val="left"/>
+      <w:pPr>
+        <w:ind w:left="720" w:hanging="360"/>
+      </w:pPr>
+      <w:rPr>
+        <w:rFonts w:ascii="Symbol" w:hAnsi="Symbol" w:hint="default"/>
+      </w:rPr>
+    </w:lvl>
+    <w:lvl w:ilvl="1" w:tplc="04090003" w:tentative="1">
+      <w:start w:val="1"/>
+      <w:numFmt w:val="bullet"/>
+      <w:lvlText w:val="o"/>
+      <w:lvlJc w:val="left"/>
+      <w:pPr>
+        <w:ind w:left="1440" w:hanging="360"/>
+      </w:pPr>
+      <w:rPr>
+        <w:rFonts w:ascii="Courier New" w:hAnsi="Courier New" w:cs="Courier New" w:hint="default"/>
+      </w:rPr>
+    </w:lvl>
+    <w:lvl w:ilvl="2" w:tplc="04090005" w:tentative="1">
+      <w:start w:val="1"/>
+      <w:numFmt w:val="bullet"/>
+      <w:lvlText w:val=""/>
+      <w:lvlJc w:val="left"/>
+      <w:pPr>
+        <w:ind w:left="2160" w:hanging="360"/>
+      </w:pPr>
+      <w:rPr>
+        <w:rFonts w:ascii="Wingdings" w:hAnsi="Wingdings" w:hint="default"/>
+      </w:rPr>
+    </w:lvl>
+    <w:lvl w:ilvl="3" w:tplc="04090001" w:tentative="1">
+      <w:start w:val="1"/>
+      <w:numFmt w:val="bullet"/>
+      <w:lvlText w:val=""/>
+      <w:lvlJc w:val="left"/>
+      <w:pPr>
+        <w:ind w:left="2880" w:hanging="360"/>
+      </w:pPr>
+      <w:rPr>
+        <w:rFonts w:ascii="Symbol" w:hAnsi="Symbol" w:hint="default"/>
+      </w:rPr>
+    </w:lvl>
+    <w:lvl w:ilvl="4" w:tplc="04090003" w:tentative="1">
+      <w:start w:val="1"/>
+      <w:numFmt w:val="bullet"/>
+      <w:lvlText w:val="o"/>
+      <w:lvlJc w:val="left"/>
+      <w:pPr>
+        <w:ind w:left="3600" w:hanging="360"/>
+      </w:pPr>
+      <w:rPr>
+        <w:rFonts w:ascii="Courier New" w:hAnsi="Courier New" w:cs="Courier New" w:hint="default"/>
+      </w:rPr>
+    </w:lvl>
+    <w:lvl w:ilvl="5" w:tplc="04090005" w:tentative="1">
+      <w:start w:val="1"/>
+      <w:numFmt w:val="bullet"/>
+      <w:lvlText w:val=""/>
+      <w:lvlJc w:val="left"/>
+      <w:pPr>
+        <w:ind w:left="4320" w:hanging="360"/>
+      </w:pPr>
+      <w:rPr>
+        <w:rFonts w:ascii="Wingdings" w:hAnsi="Wingdings" w:hint="default"/>
+      </w:rPr>
+    </w:lvl>
+    <w:lvl w:ilvl="6" w:tplc="04090001" w:tentative="1">
+      <w:start w:val="1"/>
+      <w:numFmt w:val="bullet"/>
+      <w:lvlText w:val=""/>
+      <w:lvlJc w:val="left"/>
+      <w:pPr>
+        <w:ind w:left="5040" w:hanging="360"/>
+      </w:pPr>
+      <w:rPr>
+        <w:rFonts w:ascii="Symbol" w:hAnsi="Symbol" w:hint="default"/>
+      </w:rPr>
+    </w:lvl>
+    <w:lvl w:ilvl="7" w:tplc="04090003" w:tentative="1">
+      <w:start w:val="1"/>
+      <w:numFmt w:val="bullet"/>
+      <w:lvlText w:val="o"/>
+      <w:lvlJc w:val="left"/>
+      <w:pPr>
+        <w:ind w:left="5760" w:hanging="360"/>
+      </w:pPr>
+      <w:rPr>
+        <w:rFonts w:ascii="Courier New" w:hAnsi="Courier New" w:cs="Courier New" w:hint="default"/>
+      </w:rPr>
+    </w:lvl>
+    <w:lvl w:ilvl="8" w:tplc="04090005" w:tentative="1">
+      <w:start w:val="1"/>
+      <w:numFmt w:val="bullet"/>
+      <w:lvlText w:val=""/>
+      <w:lvlJc w:val="left"/>
+      <w:pPr>
+        <w:ind w:left="6480" w:hanging="360"/>
+      </w:pPr>
+      <w:rPr>
+        <w:rFonts w:ascii="Wingdings" w:hAnsi="Wingdings" w:hint="default"/>
+      </w:rPr>
+    </w:lvl>
+  </w:abstractNum>
+  <w:abstractNum w:abstractNumId="2" w15:restartNumberingAfterBreak="0">
     <w:nsid w:val="30B3003B"/>
     <w:multiLevelType w:val="multilevel"/>
     <w:tmpl w:val="039E07A4"/>
@@ -2034,7 +2553,7 @@
       </w:rPr>
     </w:lvl>
   </w:abstractNum>
-  <w:abstractNum w:abstractNumId="2" w15:restartNumberingAfterBreak="0">
+  <w:abstractNum w:abstractNumId="3" w15:restartNumberingAfterBreak="0">
     <w:nsid w:val="6E7A0F83"/>
     <w:multiLevelType w:val="hybridMultilevel"/>
     <w:tmpl w:val="614ADBA4"/>
@@ -2121,16 +2640,135 @@
       <w:pPr>
         <w:ind w:left="6480" w:hanging="180"/>
       </w:pPr>
+    </w:lvl>
+  </w:abstractNum>
+  <w:abstractNum w:abstractNumId="4" w15:restartNumberingAfterBreak="0">
+    <w:nsid w:val="7E2E050C"/>
+    <w:multiLevelType w:val="hybridMultilevel"/>
+    <w:tmpl w:val="A392CA84"/>
+    <w:lvl w:ilvl="0" w:tplc="04090001">
+      <w:start w:val="1"/>
+      <w:numFmt w:val="bullet"/>
+      <w:lvlText w:val=""/>
+      <w:lvlJc w:val="left"/>
+      <w:pPr>
+        <w:ind w:left="720" w:hanging="360"/>
+      </w:pPr>
+      <w:rPr>
+        <w:rFonts w:ascii="Symbol" w:hAnsi="Symbol" w:hint="default"/>
+      </w:rPr>
+    </w:lvl>
+    <w:lvl w:ilvl="1" w:tplc="04090003" w:tentative="1">
+      <w:start w:val="1"/>
+      <w:numFmt w:val="bullet"/>
+      <w:lvlText w:val="o"/>
+      <w:lvlJc w:val="left"/>
+      <w:pPr>
+        <w:ind w:left="1440" w:hanging="360"/>
+      </w:pPr>
+      <w:rPr>
+        <w:rFonts w:ascii="Courier New" w:hAnsi="Courier New" w:cs="Courier New" w:hint="default"/>
+      </w:rPr>
+    </w:lvl>
+    <w:lvl w:ilvl="2" w:tplc="04090005" w:tentative="1">
+      <w:start w:val="1"/>
+      <w:numFmt w:val="bullet"/>
+      <w:lvlText w:val=""/>
+      <w:lvlJc w:val="left"/>
+      <w:pPr>
+        <w:ind w:left="2160" w:hanging="360"/>
+      </w:pPr>
+      <w:rPr>
+        <w:rFonts w:ascii="Wingdings" w:hAnsi="Wingdings" w:hint="default"/>
+      </w:rPr>
+    </w:lvl>
+    <w:lvl w:ilvl="3" w:tplc="04090001" w:tentative="1">
+      <w:start w:val="1"/>
+      <w:numFmt w:val="bullet"/>
+      <w:lvlText w:val=""/>
+      <w:lvlJc w:val="left"/>
+      <w:pPr>
+        <w:ind w:left="2880" w:hanging="360"/>
+      </w:pPr>
+      <w:rPr>
+        <w:rFonts w:ascii="Symbol" w:hAnsi="Symbol" w:hint="default"/>
+      </w:rPr>
+    </w:lvl>
+    <w:lvl w:ilvl="4" w:tplc="04090003" w:tentative="1">
+      <w:start w:val="1"/>
+      <w:numFmt w:val="bullet"/>
+      <w:lvlText w:val="o"/>
+      <w:lvlJc w:val="left"/>
+      <w:pPr>
+        <w:ind w:left="3600" w:hanging="360"/>
+      </w:pPr>
+      <w:rPr>
+        <w:rFonts w:ascii="Courier New" w:hAnsi="Courier New" w:cs="Courier New" w:hint="default"/>
+      </w:rPr>
+    </w:lvl>
+    <w:lvl w:ilvl="5" w:tplc="04090005" w:tentative="1">
+      <w:start w:val="1"/>
+      <w:numFmt w:val="bullet"/>
+      <w:lvlText w:val=""/>
+      <w:lvlJc w:val="left"/>
+      <w:pPr>
+        <w:ind w:left="4320" w:hanging="360"/>
+      </w:pPr>
+      <w:rPr>
+        <w:rFonts w:ascii="Wingdings" w:hAnsi="Wingdings" w:hint="default"/>
+      </w:rPr>
+    </w:lvl>
+    <w:lvl w:ilvl="6" w:tplc="04090001" w:tentative="1">
+      <w:start w:val="1"/>
+      <w:numFmt w:val="bullet"/>
+      <w:lvlText w:val=""/>
+      <w:lvlJc w:val="left"/>
+      <w:pPr>
+        <w:ind w:left="5040" w:hanging="360"/>
+      </w:pPr>
+      <w:rPr>
+        <w:rFonts w:ascii="Symbol" w:hAnsi="Symbol" w:hint="default"/>
+      </w:rPr>
+    </w:lvl>
+    <w:lvl w:ilvl="7" w:tplc="04090003" w:tentative="1">
+      <w:start w:val="1"/>
+      <w:numFmt w:val="bullet"/>
+      <w:lvlText w:val="o"/>
+      <w:lvlJc w:val="left"/>
+      <w:pPr>
+        <w:ind w:left="5760" w:hanging="360"/>
+      </w:pPr>
+      <w:rPr>
+        <w:rFonts w:ascii="Courier New" w:hAnsi="Courier New" w:cs="Courier New" w:hint="default"/>
+      </w:rPr>
+    </w:lvl>
+    <w:lvl w:ilvl="8" w:tplc="04090005" w:tentative="1">
+      <w:start w:val="1"/>
+      <w:numFmt w:val="bullet"/>
+      <w:lvlText w:val=""/>
+      <w:lvlJc w:val="left"/>
+      <w:pPr>
+        <w:ind w:left="6480" w:hanging="360"/>
+      </w:pPr>
+      <w:rPr>
+        <w:rFonts w:ascii="Wingdings" w:hAnsi="Wingdings" w:hint="default"/>
+      </w:rPr>
     </w:lvl>
   </w:abstractNum>
   <w:num w:numId="1" w16cid:durableId="766392989">
     <w:abstractNumId w:val="0"/>
   </w:num>
   <w:num w:numId="2" w16cid:durableId="670452088">
+    <w:abstractNumId w:val="3"/>
+  </w:num>
+  <w:num w:numId="3" w16cid:durableId="729693726">
     <w:abstractNumId w:val="2"/>
   </w:num>
-  <w:num w:numId="3" w16cid:durableId="729693726">
+  <w:num w:numId="4" w16cid:durableId="1629319883">
     <w:abstractNumId w:val="1"/>
+  </w:num>
+  <w:num w:numId="5" w16cid:durableId="1739665070">
+    <w:abstractNumId w:val="4"/>
   </w:num>
 </w:numbering>
 </file>
@@ -2737,7 +3375,6 @@
   <w:style w:type="character" w:default="1" w:styleId="DefaultParagraphFont">
     <w:name w:val="Default Paragraph Font"/>
     <w:uiPriority w:val="1"/>
-    <w:semiHidden/>
     <w:unhideWhenUsed/>
   </w:style>
   <w:style w:type="table" w:default="1" w:styleId="TableNormal">

</xml_diff>